<commit_message>
docs: session summary PDF and latest paper revision
- ParaSail_Session_Summary.pdf: mobile-readable A4 summary (cover + four
  pages) of the application changes, the deck rebuild, operations,
  verification status and open items; built with the pdf skill's report
  route (palette, ReportLab body, cover template 02, pypdf merge) and
  passing its QA checks. Also at the repository root for download.
- generate_summary_pdf.py / add_summary_cover.py: the generator and the
  cover-merge step, so the document can be rebuilt
- pick_cover.py: checks cover candidates for text running off the page and
  overlapping blocks before one is chosen
- research paper revision (author details filled in)
</commit_message>
<xml_diff>
--- a/ParaSail_Paper/ParaSail_Research_Paper (Ananthakrishnan AS).docx
+++ b/ParaSail_Paper/ParaSail_Research_Paper (Ananthakrishnan AS).docx
@@ -929,12 +929,6 @@
         <w:gridCol w:w="3690"/>
       </w:tblGrid>
       <w:tr>
-        <w:tblPrEx>
-          <w:tblCellMar>
-            <w:top w:w="0" w:type="dxa"/>
-            <w:bottom w:w="0" w:type="dxa"/>
-          </w:tblCellMar>
-        </w:tblPrEx>
         <w:trPr>
           <w:cantSplit/>
           <w:tblHeader/>
@@ -1037,12 +1031,6 @@
         </w:tc>
       </w:tr>
       <w:tr>
-        <w:tblPrEx>
-          <w:tblCellMar>
-            <w:top w:w="0" w:type="dxa"/>
-            <w:bottom w:w="0" w:type="dxa"/>
-          </w:tblCellMar>
-        </w:tblPrEx>
         <w:trPr>
           <w:cantSplit/>
         </w:trPr>
@@ -1135,12 +1123,6 @@
         </w:tc>
       </w:tr>
       <w:tr>
-        <w:tblPrEx>
-          <w:tblCellMar>
-            <w:top w:w="0" w:type="dxa"/>
-            <w:bottom w:w="0" w:type="dxa"/>
-          </w:tblCellMar>
-        </w:tblPrEx>
         <w:trPr>
           <w:cantSplit/>
         </w:trPr>
@@ -1233,12 +1215,6 @@
         </w:tc>
       </w:tr>
       <w:tr>
-        <w:tblPrEx>
-          <w:tblCellMar>
-            <w:top w:w="0" w:type="dxa"/>
-            <w:bottom w:w="0" w:type="dxa"/>
-          </w:tblCellMar>
-        </w:tblPrEx>
         <w:trPr>
           <w:cantSplit/>
         </w:trPr>
@@ -1331,12 +1307,6 @@
         </w:tc>
       </w:tr>
       <w:tr>
-        <w:tblPrEx>
-          <w:tblCellMar>
-            <w:top w:w="0" w:type="dxa"/>
-            <w:bottom w:w="0" w:type="dxa"/>
-          </w:tblCellMar>
-        </w:tblPrEx>
         <w:trPr>
           <w:cantSplit/>
         </w:trPr>
@@ -1429,12 +1399,6 @@
         </w:tc>
       </w:tr>
       <w:tr>
-        <w:tblPrEx>
-          <w:tblCellMar>
-            <w:top w:w="0" w:type="dxa"/>
-            <w:bottom w:w="0" w:type="dxa"/>
-          </w:tblCellMar>
-        </w:tblPrEx>
         <w:trPr>
           <w:cantSplit/>
         </w:trPr>
@@ -1536,12 +1500,6 @@
         </w:tc>
       </w:tr>
       <w:tr>
-        <w:tblPrEx>
-          <w:tblCellMar>
-            <w:top w:w="0" w:type="dxa"/>
-            <w:bottom w:w="0" w:type="dxa"/>
-          </w:tblCellMar>
-        </w:tblPrEx>
         <w:trPr>
           <w:cantSplit/>
         </w:trPr>
@@ -2133,12 +2091,6 @@
         <w:gridCol w:w="2952"/>
       </w:tblGrid>
       <w:tr>
-        <w:tblPrEx>
-          <w:tblCellMar>
-            <w:top w:w="0" w:type="dxa"/>
-            <w:bottom w:w="0" w:type="dxa"/>
-          </w:tblCellMar>
-        </w:tblPrEx>
         <w:trPr>
           <w:cantSplit/>
           <w:tblHeader/>
@@ -2273,12 +2225,6 @@
         </w:tc>
       </w:tr>
       <w:tr>
-        <w:tblPrEx>
-          <w:tblCellMar>
-            <w:top w:w="0" w:type="dxa"/>
-            <w:bottom w:w="0" w:type="dxa"/>
-          </w:tblCellMar>
-        </w:tblPrEx>
         <w:trPr>
           <w:cantSplit/>
         </w:trPr>
@@ -2416,12 +2362,6 @@
         </w:tc>
       </w:tr>
       <w:tr>
-        <w:tblPrEx>
-          <w:tblCellMar>
-            <w:top w:w="0" w:type="dxa"/>
-            <w:bottom w:w="0" w:type="dxa"/>
-          </w:tblCellMar>
-        </w:tblPrEx>
         <w:trPr>
           <w:cantSplit/>
         </w:trPr>
@@ -2543,12 +2483,6 @@
         </w:tc>
       </w:tr>
       <w:tr>
-        <w:tblPrEx>
-          <w:tblCellMar>
-            <w:top w:w="0" w:type="dxa"/>
-            <w:bottom w:w="0" w:type="dxa"/>
-          </w:tblCellMar>
-        </w:tblPrEx>
         <w:trPr>
           <w:cantSplit/>
         </w:trPr>
@@ -2671,12 +2605,6 @@
         </w:tc>
       </w:tr>
       <w:tr>
-        <w:tblPrEx>
-          <w:tblCellMar>
-            <w:top w:w="0" w:type="dxa"/>
-            <w:bottom w:w="0" w:type="dxa"/>
-          </w:tblCellMar>
-        </w:tblPrEx>
         <w:trPr>
           <w:cantSplit/>
         </w:trPr>
@@ -2798,12 +2726,6 @@
         </w:tc>
       </w:tr>
       <w:tr>
-        <w:tblPrEx>
-          <w:tblCellMar>
-            <w:top w:w="0" w:type="dxa"/>
-            <w:bottom w:w="0" w:type="dxa"/>
-          </w:tblCellMar>
-        </w:tblPrEx>
         <w:trPr>
           <w:cantSplit/>
         </w:trPr>
@@ -2959,12 +2881,6 @@
         </w:tc>
       </w:tr>
       <w:tr>
-        <w:tblPrEx>
-          <w:tblCellMar>
-            <w:top w:w="0" w:type="dxa"/>
-            <w:bottom w:w="0" w:type="dxa"/>
-          </w:tblCellMar>
-        </w:tblPrEx>
         <w:trPr>
           <w:cantSplit/>
         </w:trPr>
@@ -3380,12 +3296,6 @@
         <w:gridCol w:w="3875"/>
       </w:tblGrid>
       <w:tr>
-        <w:tblPrEx>
-          <w:tblCellMar>
-            <w:top w:w="0" w:type="dxa"/>
-            <w:bottom w:w="0" w:type="dxa"/>
-          </w:tblCellMar>
-        </w:tblPrEx>
         <w:trPr>
           <w:cantSplit/>
           <w:tblHeader/>
@@ -3488,12 +3398,6 @@
         </w:tc>
       </w:tr>
       <w:tr>
-        <w:tblPrEx>
-          <w:tblCellMar>
-            <w:top w:w="0" w:type="dxa"/>
-            <w:bottom w:w="0" w:type="dxa"/>
-          </w:tblCellMar>
-        </w:tblPrEx>
         <w:trPr>
           <w:cantSplit/>
         </w:trPr>
@@ -3602,12 +3506,6 @@
         </w:tc>
       </w:tr>
       <w:tr>
-        <w:tblPrEx>
-          <w:tblCellMar>
-            <w:top w:w="0" w:type="dxa"/>
-            <w:bottom w:w="0" w:type="dxa"/>
-          </w:tblCellMar>
-        </w:tblPrEx>
         <w:trPr>
           <w:cantSplit/>
         </w:trPr>
@@ -3725,12 +3623,6 @@
         </w:tc>
       </w:tr>
       <w:tr>
-        <w:tblPrEx>
-          <w:tblCellMar>
-            <w:top w:w="0" w:type="dxa"/>
-            <w:bottom w:w="0" w:type="dxa"/>
-          </w:tblCellMar>
-        </w:tblPrEx>
         <w:trPr>
           <w:cantSplit/>
         </w:trPr>
@@ -3823,12 +3715,6 @@
         </w:tc>
       </w:tr>
       <w:tr>
-        <w:tblPrEx>
-          <w:tblCellMar>
-            <w:top w:w="0" w:type="dxa"/>
-            <w:bottom w:w="0" w:type="dxa"/>
-          </w:tblCellMar>
-        </w:tblPrEx>
         <w:trPr>
           <w:cantSplit/>
         </w:trPr>
@@ -3921,12 +3807,6 @@
         </w:tc>
       </w:tr>
       <w:tr>
-        <w:tblPrEx>
-          <w:tblCellMar>
-            <w:top w:w="0" w:type="dxa"/>
-            <w:bottom w:w="0" w:type="dxa"/>
-          </w:tblCellMar>
-        </w:tblPrEx>
         <w:trPr>
           <w:cantSplit/>
         </w:trPr>
@@ -4019,12 +3899,6 @@
         </w:tc>
       </w:tr>
       <w:tr>
-        <w:tblPrEx>
-          <w:tblCellMar>
-            <w:top w:w="0" w:type="dxa"/>
-            <w:bottom w:w="0" w:type="dxa"/>
-          </w:tblCellMar>
-        </w:tblPrEx>
         <w:trPr>
           <w:cantSplit/>
         </w:trPr>
@@ -4158,12 +4032,6 @@
         </w:tc>
       </w:tr>
       <w:tr>
-        <w:tblPrEx>
-          <w:tblCellMar>
-            <w:top w:w="0" w:type="dxa"/>
-            <w:bottom w:w="0" w:type="dxa"/>
-          </w:tblCellMar>
-        </w:tblPrEx>
         <w:trPr>
           <w:cantSplit/>
         </w:trPr>
@@ -4497,12 +4365,6 @@
         <w:gridCol w:w="3506"/>
       </w:tblGrid>
       <w:tr>
-        <w:tblPrEx>
-          <w:tblCellMar>
-            <w:top w:w="0" w:type="dxa"/>
-            <w:bottom w:w="0" w:type="dxa"/>
-          </w:tblCellMar>
-        </w:tblPrEx>
         <w:trPr>
           <w:cantSplit/>
           <w:tblHeader/>
@@ -4605,12 +4467,6 @@
         </w:tc>
       </w:tr>
       <w:tr>
-        <w:tblPrEx>
-          <w:tblCellMar>
-            <w:top w:w="0" w:type="dxa"/>
-            <w:bottom w:w="0" w:type="dxa"/>
-          </w:tblCellMar>
-        </w:tblPrEx>
         <w:trPr>
           <w:cantSplit/>
         </w:trPr>
@@ -4712,12 +4568,6 @@
         </w:tc>
       </w:tr>
       <w:tr>
-        <w:tblPrEx>
-          <w:tblCellMar>
-            <w:top w:w="0" w:type="dxa"/>
-            <w:bottom w:w="0" w:type="dxa"/>
-          </w:tblCellMar>
-        </w:tblPrEx>
         <w:trPr>
           <w:cantSplit/>
         </w:trPr>
@@ -4810,12 +4660,6 @@
         </w:tc>
       </w:tr>
       <w:tr>
-        <w:tblPrEx>
-          <w:tblCellMar>
-            <w:top w:w="0" w:type="dxa"/>
-            <w:bottom w:w="0" w:type="dxa"/>
-          </w:tblCellMar>
-        </w:tblPrEx>
         <w:trPr>
           <w:cantSplit/>
         </w:trPr>
@@ -4908,12 +4752,6 @@
         </w:tc>
       </w:tr>
       <w:tr>
-        <w:tblPrEx>
-          <w:tblCellMar>
-            <w:top w:w="0" w:type="dxa"/>
-            <w:bottom w:w="0" w:type="dxa"/>
-          </w:tblCellMar>
-        </w:tblPrEx>
         <w:trPr>
           <w:cantSplit/>
         </w:trPr>
@@ -5208,12 +5046,6 @@
         <w:gridCol w:w="2335"/>
       </w:tblGrid>
       <w:tr>
-        <w:tblPrEx>
-          <w:tblCellMar>
-            <w:top w:w="0" w:type="dxa"/>
-            <w:bottom w:w="0" w:type="dxa"/>
-          </w:tblCellMar>
-        </w:tblPrEx>
         <w:trPr>
           <w:cantSplit/>
           <w:tblHeader/>
@@ -5348,12 +5180,6 @@
         </w:tc>
       </w:tr>
       <w:tr>
-        <w:tblPrEx>
-          <w:tblCellMar>
-            <w:top w:w="0" w:type="dxa"/>
-            <w:bottom w:w="0" w:type="dxa"/>
-          </w:tblCellMar>
-        </w:tblPrEx>
         <w:trPr>
           <w:cantSplit/>
         </w:trPr>
@@ -5475,12 +5301,6 @@
         </w:tc>
       </w:tr>
       <w:tr>
-        <w:tblPrEx>
-          <w:tblCellMar>
-            <w:top w:w="0" w:type="dxa"/>
-            <w:bottom w:w="0" w:type="dxa"/>
-          </w:tblCellMar>
-        </w:tblPrEx>
         <w:trPr>
           <w:cantSplit/>
         </w:trPr>
@@ -5602,12 +5422,6 @@
         </w:tc>
       </w:tr>
       <w:tr>
-        <w:tblPrEx>
-          <w:tblCellMar>
-            <w:top w:w="0" w:type="dxa"/>
-            <w:bottom w:w="0" w:type="dxa"/>
-          </w:tblCellMar>
-        </w:tblPrEx>
         <w:trPr>
           <w:cantSplit/>
         </w:trPr>
@@ -5729,12 +5543,6 @@
         </w:tc>
       </w:tr>
       <w:tr>
-        <w:tblPrEx>
-          <w:tblCellMar>
-            <w:top w:w="0" w:type="dxa"/>
-            <w:bottom w:w="0" w:type="dxa"/>
-          </w:tblCellMar>
-        </w:tblPrEx>
         <w:trPr>
           <w:cantSplit/>
         </w:trPr>
@@ -5964,12 +5772,6 @@
         <w:gridCol w:w="4428"/>
       </w:tblGrid>
       <w:tr>
-        <w:tblPrEx>
-          <w:tblCellMar>
-            <w:top w:w="0" w:type="dxa"/>
-            <w:bottom w:w="0" w:type="dxa"/>
-          </w:tblCellMar>
-        </w:tblPrEx>
         <w:trPr>
           <w:cantSplit/>
           <w:tblHeader/>
@@ -6072,12 +5874,6 @@
         </w:tc>
       </w:tr>
       <w:tr>
-        <w:tblPrEx>
-          <w:tblCellMar>
-            <w:top w:w="0" w:type="dxa"/>
-            <w:bottom w:w="0" w:type="dxa"/>
-          </w:tblCellMar>
-        </w:tblPrEx>
         <w:trPr>
           <w:cantSplit/>
         </w:trPr>
@@ -6170,12 +5966,6 @@
         </w:tc>
       </w:tr>
       <w:tr>
-        <w:tblPrEx>
-          <w:tblCellMar>
-            <w:top w:w="0" w:type="dxa"/>
-            <w:bottom w:w="0" w:type="dxa"/>
-          </w:tblCellMar>
-        </w:tblPrEx>
         <w:trPr>
           <w:cantSplit/>
         </w:trPr>
@@ -6268,12 +6058,6 @@
         </w:tc>
       </w:tr>
       <w:tr>
-        <w:tblPrEx>
-          <w:tblCellMar>
-            <w:top w:w="0" w:type="dxa"/>
-            <w:bottom w:w="0" w:type="dxa"/>
-          </w:tblCellMar>
-        </w:tblPrEx>
         <w:trPr>
           <w:cantSplit/>
         </w:trPr>
@@ -6366,12 +6150,6 @@
         </w:tc>
       </w:tr>
       <w:tr>
-        <w:tblPrEx>
-          <w:tblCellMar>
-            <w:top w:w="0" w:type="dxa"/>
-            <w:bottom w:w="0" w:type="dxa"/>
-          </w:tblCellMar>
-        </w:tblPrEx>
         <w:trPr>
           <w:cantSplit/>
         </w:trPr>
@@ -6473,12 +6251,6 @@
         </w:tc>
       </w:tr>
       <w:tr>
-        <w:tblPrEx>
-          <w:tblCellMar>
-            <w:top w:w="0" w:type="dxa"/>
-            <w:bottom w:w="0" w:type="dxa"/>
-          </w:tblCellMar>
-        </w:tblPrEx>
         <w:trPr>
           <w:cantSplit/>
         </w:trPr>
@@ -6571,12 +6343,6 @@
         </w:tc>
       </w:tr>
       <w:tr>
-        <w:tblPrEx>
-          <w:tblCellMar>
-            <w:top w:w="0" w:type="dxa"/>
-            <w:bottom w:w="0" w:type="dxa"/>
-          </w:tblCellMar>
-        </w:tblPrEx>
         <w:trPr>
           <w:cantSplit/>
         </w:trPr>
@@ -6669,12 +6435,6 @@
         </w:tc>
       </w:tr>
       <w:tr>
-        <w:tblPrEx>
-          <w:tblCellMar>
-            <w:top w:w="0" w:type="dxa"/>
-            <w:bottom w:w="0" w:type="dxa"/>
-          </w:tblCellMar>
-        </w:tblPrEx>
         <w:trPr>
           <w:cantSplit/>
         </w:trPr>
@@ -7017,12 +6777,6 @@
         <w:gridCol w:w="2583"/>
       </w:tblGrid>
       <w:tr>
-        <w:tblPrEx>
-          <w:tblCellMar>
-            <w:top w:w="0" w:type="dxa"/>
-            <w:bottom w:w="0" w:type="dxa"/>
-          </w:tblCellMar>
-        </w:tblPrEx>
         <w:trPr>
           <w:cantSplit/>
           <w:tblHeader/>
@@ -7157,12 +6911,6 @@
         </w:tc>
       </w:tr>
       <w:tr>
-        <w:tblPrEx>
-          <w:tblCellMar>
-            <w:top w:w="0" w:type="dxa"/>
-            <w:bottom w:w="0" w:type="dxa"/>
-          </w:tblCellMar>
-        </w:tblPrEx>
         <w:trPr>
           <w:cantSplit/>
         </w:trPr>
@@ -7297,12 +7045,6 @@
         </w:tc>
       </w:tr>
       <w:tr>
-        <w:tblPrEx>
-          <w:tblCellMar>
-            <w:top w:w="0" w:type="dxa"/>
-            <w:bottom w:w="0" w:type="dxa"/>
-          </w:tblCellMar>
-        </w:tblPrEx>
         <w:trPr>
           <w:cantSplit/>
         </w:trPr>
@@ -7448,12 +7190,6 @@
         </w:tc>
       </w:tr>
       <w:tr>
-        <w:tblPrEx>
-          <w:tblCellMar>
-            <w:top w:w="0" w:type="dxa"/>
-            <w:bottom w:w="0" w:type="dxa"/>
-          </w:tblCellMar>
-        </w:tblPrEx>
         <w:trPr>
           <w:cantSplit/>
         </w:trPr>
@@ -7588,12 +7324,6 @@
         </w:tc>
       </w:tr>
       <w:tr>
-        <w:tblPrEx>
-          <w:tblCellMar>
-            <w:top w:w="0" w:type="dxa"/>
-            <w:bottom w:w="0" w:type="dxa"/>
-          </w:tblCellMar>
-        </w:tblPrEx>
         <w:trPr>
           <w:cantSplit/>
         </w:trPr>
@@ -7960,12 +7690,6 @@
         <w:gridCol w:w="3506"/>
       </w:tblGrid>
       <w:tr>
-        <w:tblPrEx>
-          <w:tblCellMar>
-            <w:top w:w="0" w:type="dxa"/>
-            <w:bottom w:w="0" w:type="dxa"/>
-          </w:tblCellMar>
-        </w:tblPrEx>
         <w:trPr>
           <w:cantSplit/>
           <w:tblHeader/>
@@ -8068,12 +7792,6 @@
         </w:tc>
       </w:tr>
       <w:tr>
-        <w:tblPrEx>
-          <w:tblCellMar>
-            <w:top w:w="0" w:type="dxa"/>
-            <w:bottom w:w="0" w:type="dxa"/>
-          </w:tblCellMar>
-        </w:tblPrEx>
         <w:trPr>
           <w:cantSplit/>
         </w:trPr>
@@ -8166,12 +7884,6 @@
         </w:tc>
       </w:tr>
       <w:tr>
-        <w:tblPrEx>
-          <w:tblCellMar>
-            <w:top w:w="0" w:type="dxa"/>
-            <w:bottom w:w="0" w:type="dxa"/>
-          </w:tblCellMar>
-        </w:tblPrEx>
         <w:trPr>
           <w:cantSplit/>
         </w:trPr>
@@ -8264,12 +7976,6 @@
         </w:tc>
       </w:tr>
       <w:tr>
-        <w:tblPrEx>
-          <w:tblCellMar>
-            <w:top w:w="0" w:type="dxa"/>
-            <w:bottom w:w="0" w:type="dxa"/>
-          </w:tblCellMar>
-        </w:tblPrEx>
         <w:trPr>
           <w:cantSplit/>
         </w:trPr>
@@ -8371,12 +8077,6 @@
         </w:tc>
       </w:tr>
       <w:tr>
-        <w:tblPrEx>
-          <w:tblCellMar>
-            <w:top w:w="0" w:type="dxa"/>
-            <w:bottom w:w="0" w:type="dxa"/>
-          </w:tblCellMar>
-        </w:tblPrEx>
         <w:trPr>
           <w:cantSplit/>
         </w:trPr>
@@ -8469,12 +8169,6 @@
         </w:tc>
       </w:tr>
       <w:tr>
-        <w:tblPrEx>
-          <w:tblCellMar>
-            <w:top w:w="0" w:type="dxa"/>
-            <w:bottom w:w="0" w:type="dxa"/>
-          </w:tblCellMar>
-        </w:tblPrEx>
         <w:trPr>
           <w:cantSplit/>
         </w:trPr>
@@ -8733,12 +8427,6 @@
         <w:gridCol w:w="6458"/>
       </w:tblGrid>
       <w:tr>
-        <w:tblPrEx>
-          <w:tblCellMar>
-            <w:top w:w="0" w:type="dxa"/>
-            <w:bottom w:w="0" w:type="dxa"/>
-          </w:tblCellMar>
-        </w:tblPrEx>
         <w:trPr>
           <w:cantSplit/>
           <w:tblHeader/>
@@ -8809,12 +8497,6 @@
         </w:tc>
       </w:tr>
       <w:tr>
-        <w:tblPrEx>
-          <w:tblCellMar>
-            <w:top w:w="0" w:type="dxa"/>
-            <w:bottom w:w="0" w:type="dxa"/>
-          </w:tblCellMar>
-        </w:tblPrEx>
         <w:trPr>
           <w:cantSplit/>
         </w:trPr>
@@ -8878,12 +8560,6 @@
         </w:tc>
       </w:tr>
       <w:tr>
-        <w:tblPrEx>
-          <w:tblCellMar>
-            <w:top w:w="0" w:type="dxa"/>
-            <w:bottom w:w="0" w:type="dxa"/>
-          </w:tblCellMar>
-        </w:tblPrEx>
         <w:trPr>
           <w:cantSplit/>
         </w:trPr>
@@ -8956,12 +8632,6 @@
         </w:tc>
       </w:tr>
       <w:tr>
-        <w:tblPrEx>
-          <w:tblCellMar>
-            <w:top w:w="0" w:type="dxa"/>
-            <w:bottom w:w="0" w:type="dxa"/>
-          </w:tblCellMar>
-        </w:tblPrEx>
         <w:trPr>
           <w:cantSplit/>
         </w:trPr>
@@ -9041,12 +8711,6 @@
         </w:tc>
       </w:tr>
       <w:tr>
-        <w:tblPrEx>
-          <w:tblCellMar>
-            <w:top w:w="0" w:type="dxa"/>
-            <w:bottom w:w="0" w:type="dxa"/>
-          </w:tblCellMar>
-        </w:tblPrEx>
         <w:trPr>
           <w:cantSplit/>
         </w:trPr>
@@ -9110,12 +8774,6 @@
         </w:tc>
       </w:tr>
       <w:tr>
-        <w:tblPrEx>
-          <w:tblCellMar>
-            <w:top w:w="0" w:type="dxa"/>
-            <w:bottom w:w="0" w:type="dxa"/>
-          </w:tblCellMar>
-        </w:tblPrEx>
         <w:trPr>
           <w:cantSplit/>
         </w:trPr>
@@ -10354,8 +10012,12 @@
       </w:r>
     </w:p>
     <w:sectPr>
-      <w:headerReference w:type="default" r:id="rId7"/>
-      <w:footerReference w:type="default" r:id="rId8"/>
+      <w:headerReference w:type="even" r:id="rId7"/>
+      <w:headerReference w:type="default" r:id="rId8"/>
+      <w:footerReference w:type="even" r:id="rId9"/>
+      <w:footerReference w:type="default" r:id="rId10"/>
+      <w:headerReference w:type="first" r:id="rId11"/>
+      <w:footerReference w:type="first" r:id="rId12"/>
       <w:pgSz w:w="11906" w:h="16838"/>
       <w:pgMar w:top="1180" w:right="1240" w:bottom="1180" w:left="1440" w:header="700" w:footer="780" w:gutter="0"/>
       <w:pgNumType w:start="1"/>
@@ -10392,6 +10054,16 @@
 </file>
 
 <file path=word/footer1.xml><?xml version="1.0" encoding="utf-8"?>
+<w:ftr xmlns:wpc="http://schemas.microsoft.com/office/word/2010/wordprocessingCanvas" xmlns:cx="http://schemas.microsoft.com/office/drawing/2014/chartex" xmlns:cx1="http://schemas.microsoft.com/office/drawing/2015/9/8/chartex" xmlns:cx2="http://schemas.microsoft.com/office/drawing/2015/10/21/chartex" xmlns:cx3="http://schemas.microsoft.com/office/drawing/2016/5/9/chartex" xmlns:cx4="http://schemas.microsoft.com/office/drawing/2016/5/10/chartex" xmlns:cx5="http://schemas.microsoft.com/office/drawing/2016/5/11/chartex" xmlns:cx6="http://schemas.microsoft.com/office/drawing/2016/5/12/chartex" xmlns:cx7="http://schemas.microsoft.com/office/drawing/2016/5/13/chartex" xmlns:cx8="http://schemas.microsoft.com/office/drawing/2016/5/14/chartex" xmlns:mc="http://schemas.openxmlformats.org/markup-compatibility/2006" xmlns:aink="http://schemas.microsoft.com/office/drawing/2016/ink" xmlns:am3d="http://schemas.microsoft.com/office/drawing/2017/model3d" xmlns:o="urn:schemas-microsoft-com:office:office" xmlns:oel="http://schemas.microsoft.com/office/2019/extlst" xmlns:r="http://schemas.openxmlformats.org/officeDocument/2006/relationships" xmlns:m="http://schemas.openxmlformats.org/officeDocument/2006/math" xmlns:v="urn:schemas-microsoft-com:vml" xmlns:wp14="http://schemas.microsoft.com/office/word/2010/wordprocessingDrawing" xmlns:wp="http://schemas.openxmlformats.org/drawingml/2006/wordprocessingDrawing" xmlns:w10="urn:schemas-microsoft-com:office:word" xmlns:w="http://schemas.openxmlformats.org/wordprocessingml/2006/main" xmlns:w14="http://schemas.microsoft.com/office/word/2010/wordml" xmlns:w15="http://schemas.microsoft.com/office/word/2012/wordml" xmlns:w16cex="http://schemas.microsoft.com/office/word/2018/wordml/cex" xmlns:w16cid="http://schemas.microsoft.com/office/word/2016/wordml/cid" xmlns:w16="http://schemas.microsoft.com/office/word/2018/wordml" xmlns:w16du="http://schemas.microsoft.com/office/word/2023/wordml/word16du" xmlns:w16sdtdh="http://schemas.microsoft.com/office/word/2020/wordml/sdtdatahash" xmlns:w16sdtfl="http://schemas.microsoft.com/office/word/2024/wordml/sdtformatlock" xmlns:w16se="http://schemas.microsoft.com/office/word/2015/wordml/symex" xmlns:wpg="http://schemas.microsoft.com/office/word/2010/wordprocessingGroup" xmlns:wpi="http://schemas.microsoft.com/office/word/2010/wordprocessingInk" xmlns:wne="http://schemas.microsoft.com/office/word/2006/wordml" xmlns:wps="http://schemas.microsoft.com/office/word/2010/wordprocessingShape" mc:Ignorable="w14 w15 w16se w16cid w16 w16cex w16sdtdh w16sdtfl w16du wp14">
+  <w:p>
+    <w:pPr>
+      <w:pStyle w:val="Footer"/>
+    </w:pPr>
+  </w:p>
+</w:ftr>
+</file>
+
+<file path=word/footer2.xml><?xml version="1.0" encoding="utf-8"?>
 <w:ftr xmlns:wpc="http://schemas.microsoft.com/office/word/2010/wordprocessingCanvas" xmlns:cx="http://schemas.microsoft.com/office/drawing/2014/chartex" xmlns:cx1="http://schemas.microsoft.com/office/drawing/2015/9/8/chartex" xmlns:cx2="http://schemas.microsoft.com/office/drawing/2015/10/21/chartex" xmlns:cx3="http://schemas.microsoft.com/office/drawing/2016/5/9/chartex" xmlns:cx4="http://schemas.microsoft.com/office/drawing/2016/5/10/chartex" xmlns:cx5="http://schemas.microsoft.com/office/drawing/2016/5/11/chartex" xmlns:cx6="http://schemas.microsoft.com/office/drawing/2016/5/12/chartex" xmlns:cx7="http://schemas.microsoft.com/office/drawing/2016/5/13/chartex" xmlns:cx8="http://schemas.microsoft.com/office/drawing/2016/5/14/chartex" xmlns:mc="http://schemas.openxmlformats.org/markup-compatibility/2006" xmlns:aink="http://schemas.microsoft.com/office/drawing/2016/ink" xmlns:am3d="http://schemas.microsoft.com/office/drawing/2017/model3d" xmlns:o="urn:schemas-microsoft-com:office:office" xmlns:oel="http://schemas.microsoft.com/office/2019/extlst" xmlns:r="http://schemas.openxmlformats.org/officeDocument/2006/relationships" xmlns:m="http://schemas.openxmlformats.org/officeDocument/2006/math" xmlns:v="urn:schemas-microsoft-com:vml" xmlns:wp14="http://schemas.microsoft.com/office/word/2010/wordprocessingDrawing" xmlns:wp="http://schemas.openxmlformats.org/drawingml/2006/wordprocessingDrawing" xmlns:w10="urn:schemas-microsoft-com:office:word" xmlns:w="http://schemas.openxmlformats.org/wordprocessingml/2006/main" xmlns:w14="http://schemas.microsoft.com/office/word/2010/wordml" xmlns:w15="http://schemas.microsoft.com/office/word/2012/wordml" xmlns:w16cex="http://schemas.microsoft.com/office/word/2018/wordml/cex" xmlns:w16cid="http://schemas.microsoft.com/office/word/2016/wordml/cid" xmlns:w16="http://schemas.microsoft.com/office/word/2018/wordml" xmlns:w16du="http://schemas.microsoft.com/office/word/2023/wordml/word16du" xmlns:w16sdtdh="http://schemas.microsoft.com/office/word/2020/wordml/sdtdatahash" xmlns:w16sdtfl="http://schemas.microsoft.com/office/word/2024/wordml/sdtformatlock" xmlns:w16se="http://schemas.microsoft.com/office/word/2015/wordml/symex" xmlns:wpg="http://schemas.microsoft.com/office/word/2010/wordprocessingGroup" xmlns:wpi="http://schemas.microsoft.com/office/word/2010/wordprocessingInk" xmlns:wne="http://schemas.microsoft.com/office/word/2006/wordml" xmlns:wps="http://schemas.microsoft.com/office/word/2010/wordprocessingShape" mc:Ignorable="w14 w15 w16se w16cid w16 w16cex w16sdtdh w16sdtfl w16du wp14">
   <w:p>
     <w:pPr>
@@ -10442,6 +10114,16 @@
 </w:ftr>
 </file>
 
+<file path=word/footer3.xml><?xml version="1.0" encoding="utf-8"?>
+<w:ftr xmlns:wpc="http://schemas.microsoft.com/office/word/2010/wordprocessingCanvas" xmlns:cx="http://schemas.microsoft.com/office/drawing/2014/chartex" xmlns:cx1="http://schemas.microsoft.com/office/drawing/2015/9/8/chartex" xmlns:cx2="http://schemas.microsoft.com/office/drawing/2015/10/21/chartex" xmlns:cx3="http://schemas.microsoft.com/office/drawing/2016/5/9/chartex" xmlns:cx4="http://schemas.microsoft.com/office/drawing/2016/5/10/chartex" xmlns:cx5="http://schemas.microsoft.com/office/drawing/2016/5/11/chartex" xmlns:cx6="http://schemas.microsoft.com/office/drawing/2016/5/12/chartex" xmlns:cx7="http://schemas.microsoft.com/office/drawing/2016/5/13/chartex" xmlns:cx8="http://schemas.microsoft.com/office/drawing/2016/5/14/chartex" xmlns:mc="http://schemas.openxmlformats.org/markup-compatibility/2006" xmlns:aink="http://schemas.microsoft.com/office/drawing/2016/ink" xmlns:am3d="http://schemas.microsoft.com/office/drawing/2017/model3d" xmlns:o="urn:schemas-microsoft-com:office:office" xmlns:oel="http://schemas.microsoft.com/office/2019/extlst" xmlns:r="http://schemas.openxmlformats.org/officeDocument/2006/relationships" xmlns:m="http://schemas.openxmlformats.org/officeDocument/2006/math" xmlns:v="urn:schemas-microsoft-com:vml" xmlns:wp14="http://schemas.microsoft.com/office/word/2010/wordprocessingDrawing" xmlns:wp="http://schemas.openxmlformats.org/drawingml/2006/wordprocessingDrawing" xmlns:w10="urn:schemas-microsoft-com:office:word" xmlns:w="http://schemas.openxmlformats.org/wordprocessingml/2006/main" xmlns:w14="http://schemas.microsoft.com/office/word/2010/wordml" xmlns:w15="http://schemas.microsoft.com/office/word/2012/wordml" xmlns:w16cex="http://schemas.microsoft.com/office/word/2018/wordml/cex" xmlns:w16cid="http://schemas.microsoft.com/office/word/2016/wordml/cid" xmlns:w16="http://schemas.microsoft.com/office/word/2018/wordml" xmlns:w16du="http://schemas.microsoft.com/office/word/2023/wordml/word16du" xmlns:w16sdtdh="http://schemas.microsoft.com/office/word/2020/wordml/sdtdatahash" xmlns:w16sdtfl="http://schemas.microsoft.com/office/word/2024/wordml/sdtformatlock" xmlns:w16se="http://schemas.microsoft.com/office/word/2015/wordml/symex" xmlns:wpg="http://schemas.microsoft.com/office/word/2010/wordprocessingGroup" xmlns:wpi="http://schemas.microsoft.com/office/word/2010/wordprocessingInk" xmlns:wne="http://schemas.microsoft.com/office/word/2006/wordml" xmlns:wps="http://schemas.microsoft.com/office/word/2010/wordprocessingShape" mc:Ignorable="w14 w15 w16se w16cid w16 w16cex w16sdtdh w16sdtfl w16du wp14">
+  <w:p>
+    <w:pPr>
+      <w:pStyle w:val="Footer"/>
+    </w:pPr>
+  </w:p>
+</w:ftr>
+</file>
+
 <file path=word/footnotes.xml><?xml version="1.0" encoding="utf-8"?>
 <w:footnotes xmlns:wpc="http://schemas.microsoft.com/office/word/2010/wordprocessingCanvas" xmlns:cx="http://schemas.microsoft.com/office/drawing/2014/chartex" xmlns:cx1="http://schemas.microsoft.com/office/drawing/2015/9/8/chartex" xmlns:cx2="http://schemas.microsoft.com/office/drawing/2015/10/21/chartex" xmlns:cx3="http://schemas.microsoft.com/office/drawing/2016/5/9/chartex" xmlns:cx4="http://schemas.microsoft.com/office/drawing/2016/5/10/chartex" xmlns:cx5="http://schemas.microsoft.com/office/drawing/2016/5/11/chartex" xmlns:cx6="http://schemas.microsoft.com/office/drawing/2016/5/12/chartex" xmlns:cx7="http://schemas.microsoft.com/office/drawing/2016/5/13/chartex" xmlns:cx8="http://schemas.microsoft.com/office/drawing/2016/5/14/chartex" xmlns:mc="http://schemas.openxmlformats.org/markup-compatibility/2006" xmlns:aink="http://schemas.microsoft.com/office/drawing/2016/ink" xmlns:am3d="http://schemas.microsoft.com/office/drawing/2017/model3d" xmlns:o="urn:schemas-microsoft-com:office:office" xmlns:oel="http://schemas.microsoft.com/office/2019/extlst" xmlns:r="http://schemas.openxmlformats.org/officeDocument/2006/relationships" xmlns:m="http://schemas.openxmlformats.org/officeDocument/2006/math" xmlns:v="urn:schemas-microsoft-com:vml" xmlns:wp14="http://schemas.microsoft.com/office/word/2010/wordprocessingDrawing" xmlns:wp="http://schemas.openxmlformats.org/drawingml/2006/wordprocessingDrawing" xmlns:w10="urn:schemas-microsoft-com:office:word" xmlns:w="http://schemas.openxmlformats.org/wordprocessingml/2006/main" xmlns:w14="http://schemas.microsoft.com/office/word/2010/wordml" xmlns:w15="http://schemas.microsoft.com/office/word/2012/wordml" xmlns:w16cex="http://schemas.microsoft.com/office/word/2018/wordml/cex" xmlns:w16cid="http://schemas.microsoft.com/office/word/2016/wordml/cid" xmlns:w16="http://schemas.microsoft.com/office/word/2018/wordml" xmlns:w16du="http://schemas.microsoft.com/office/word/2023/wordml/word16du" xmlns:w16sdtdh="http://schemas.microsoft.com/office/word/2020/wordml/sdtdatahash" xmlns:w16sdtfl="http://schemas.microsoft.com/office/word/2024/wordml/sdtformatlock" xmlns:w16se="http://schemas.microsoft.com/office/word/2015/wordml/symex" xmlns:wpg="http://schemas.microsoft.com/office/word/2010/wordprocessingGroup" xmlns:wpi="http://schemas.microsoft.com/office/word/2010/wordprocessingInk" xmlns:wne="http://schemas.microsoft.com/office/word/2006/wordml" xmlns:wps="http://schemas.microsoft.com/office/word/2010/wordprocessingShape" mc:Ignorable="w14 w15 w16se w16cid w16 w16cex w16sdtdh w16sdtfl w16du wp14">
   <w:footnote w:type="separator" w:id="-1">
@@ -10468,6 +10150,16 @@
 </file>
 
 <file path=word/header1.xml><?xml version="1.0" encoding="utf-8"?>
+<w:hdr xmlns:wpc="http://schemas.microsoft.com/office/word/2010/wordprocessingCanvas" xmlns:cx="http://schemas.microsoft.com/office/drawing/2014/chartex" xmlns:cx1="http://schemas.microsoft.com/office/drawing/2015/9/8/chartex" xmlns:cx2="http://schemas.microsoft.com/office/drawing/2015/10/21/chartex" xmlns:cx3="http://schemas.microsoft.com/office/drawing/2016/5/9/chartex" xmlns:cx4="http://schemas.microsoft.com/office/drawing/2016/5/10/chartex" xmlns:cx5="http://schemas.microsoft.com/office/drawing/2016/5/11/chartex" xmlns:cx6="http://schemas.microsoft.com/office/drawing/2016/5/12/chartex" xmlns:cx7="http://schemas.microsoft.com/office/drawing/2016/5/13/chartex" xmlns:cx8="http://schemas.microsoft.com/office/drawing/2016/5/14/chartex" xmlns:mc="http://schemas.openxmlformats.org/markup-compatibility/2006" xmlns:aink="http://schemas.microsoft.com/office/drawing/2016/ink" xmlns:am3d="http://schemas.microsoft.com/office/drawing/2017/model3d" xmlns:o="urn:schemas-microsoft-com:office:office" xmlns:oel="http://schemas.microsoft.com/office/2019/extlst" xmlns:r="http://schemas.openxmlformats.org/officeDocument/2006/relationships" xmlns:m="http://schemas.openxmlformats.org/officeDocument/2006/math" xmlns:v="urn:schemas-microsoft-com:vml" xmlns:wp14="http://schemas.microsoft.com/office/word/2010/wordprocessingDrawing" xmlns:wp="http://schemas.openxmlformats.org/drawingml/2006/wordprocessingDrawing" xmlns:w10="urn:schemas-microsoft-com:office:word" xmlns:w="http://schemas.openxmlformats.org/wordprocessingml/2006/main" xmlns:w14="http://schemas.microsoft.com/office/word/2010/wordml" xmlns:w15="http://schemas.microsoft.com/office/word/2012/wordml" xmlns:w16cex="http://schemas.microsoft.com/office/word/2018/wordml/cex" xmlns:w16cid="http://schemas.microsoft.com/office/word/2016/wordml/cid" xmlns:w16="http://schemas.microsoft.com/office/word/2018/wordml" xmlns:w16du="http://schemas.microsoft.com/office/word/2023/wordml/word16du" xmlns:w16sdtdh="http://schemas.microsoft.com/office/word/2020/wordml/sdtdatahash" xmlns:w16sdtfl="http://schemas.microsoft.com/office/word/2024/wordml/sdtformatlock" xmlns:w16se="http://schemas.microsoft.com/office/word/2015/wordml/symex" xmlns:wpg="http://schemas.microsoft.com/office/word/2010/wordprocessingGroup" xmlns:wpi="http://schemas.microsoft.com/office/word/2010/wordprocessingInk" xmlns:wne="http://schemas.microsoft.com/office/word/2006/wordml" xmlns:wps="http://schemas.microsoft.com/office/word/2010/wordprocessingShape" mc:Ignorable="w14 w15 w16se w16cid w16 w16cex w16sdtdh w16sdtfl w16du wp14">
+  <w:p>
+    <w:pPr>
+      <w:pStyle w:val="Header"/>
+    </w:pPr>
+  </w:p>
+</w:hdr>
+</file>
+
+<file path=word/header2.xml><?xml version="1.0" encoding="utf-8"?>
 <w:hdr xmlns:wpc="http://schemas.microsoft.com/office/word/2010/wordprocessingCanvas" xmlns:cx="http://schemas.microsoft.com/office/drawing/2014/chartex" xmlns:cx1="http://schemas.microsoft.com/office/drawing/2015/9/8/chartex" xmlns:cx2="http://schemas.microsoft.com/office/drawing/2015/10/21/chartex" xmlns:cx3="http://schemas.microsoft.com/office/drawing/2016/5/9/chartex" xmlns:cx4="http://schemas.microsoft.com/office/drawing/2016/5/10/chartex" xmlns:cx5="http://schemas.microsoft.com/office/drawing/2016/5/11/chartex" xmlns:cx6="http://schemas.microsoft.com/office/drawing/2016/5/12/chartex" xmlns:cx7="http://schemas.microsoft.com/office/drawing/2016/5/13/chartex" xmlns:cx8="http://schemas.microsoft.com/office/drawing/2016/5/14/chartex" xmlns:mc="http://schemas.openxmlformats.org/markup-compatibility/2006" xmlns:aink="http://schemas.microsoft.com/office/drawing/2016/ink" xmlns:am3d="http://schemas.microsoft.com/office/drawing/2017/model3d" xmlns:o="urn:schemas-microsoft-com:office:office" xmlns:oel="http://schemas.microsoft.com/office/2019/extlst" xmlns:r="http://schemas.openxmlformats.org/officeDocument/2006/relationships" xmlns:m="http://schemas.openxmlformats.org/officeDocument/2006/math" xmlns:v="urn:schemas-microsoft-com:vml" xmlns:wp14="http://schemas.microsoft.com/office/word/2010/wordprocessingDrawing" xmlns:wp="http://schemas.openxmlformats.org/drawingml/2006/wordprocessingDrawing" xmlns:w10="urn:schemas-microsoft-com:office:word" xmlns:w="http://schemas.openxmlformats.org/wordprocessingml/2006/main" xmlns:w14="http://schemas.microsoft.com/office/word/2010/wordml" xmlns:w15="http://schemas.microsoft.com/office/word/2012/wordml" xmlns:w16cex="http://schemas.microsoft.com/office/word/2018/wordml/cex" xmlns:w16cid="http://schemas.microsoft.com/office/word/2016/wordml/cid" xmlns:w16="http://schemas.microsoft.com/office/word/2018/wordml" xmlns:w16du="http://schemas.microsoft.com/office/word/2023/wordml/word16du" xmlns:w16sdtdh="http://schemas.microsoft.com/office/word/2020/wordml/sdtdatahash" xmlns:w16sdtfl="http://schemas.microsoft.com/office/word/2024/wordml/sdtformatlock" xmlns:w16se="http://schemas.microsoft.com/office/word/2015/wordml/symex" xmlns:wpg="http://schemas.microsoft.com/office/word/2010/wordprocessingGroup" xmlns:wpi="http://schemas.microsoft.com/office/word/2010/wordprocessingInk" xmlns:wne="http://schemas.microsoft.com/office/word/2006/wordml" xmlns:wps="http://schemas.microsoft.com/office/word/2010/wordprocessingShape" mc:Ignorable="w14 w15 w16se w16cid w16 w16cex w16sdtdh w16sdtfl w16du wp14">
   <w:p>
     <w:pPr>
@@ -10504,6 +10196,16 @@
       </w:rPr>
       <w:t xml:space="preserve">  26th Digital Blue Economy Summit</w:t>
     </w:r>
+  </w:p>
+</w:hdr>
+</file>
+
+<file path=word/header3.xml><?xml version="1.0" encoding="utf-8"?>
+<w:hdr xmlns:wpc="http://schemas.microsoft.com/office/word/2010/wordprocessingCanvas" xmlns:cx="http://schemas.microsoft.com/office/drawing/2014/chartex" xmlns:cx1="http://schemas.microsoft.com/office/drawing/2015/9/8/chartex" xmlns:cx2="http://schemas.microsoft.com/office/drawing/2015/10/21/chartex" xmlns:cx3="http://schemas.microsoft.com/office/drawing/2016/5/9/chartex" xmlns:cx4="http://schemas.microsoft.com/office/drawing/2016/5/10/chartex" xmlns:cx5="http://schemas.microsoft.com/office/drawing/2016/5/11/chartex" xmlns:cx6="http://schemas.microsoft.com/office/drawing/2016/5/12/chartex" xmlns:cx7="http://schemas.microsoft.com/office/drawing/2016/5/13/chartex" xmlns:cx8="http://schemas.microsoft.com/office/drawing/2016/5/14/chartex" xmlns:mc="http://schemas.openxmlformats.org/markup-compatibility/2006" xmlns:aink="http://schemas.microsoft.com/office/drawing/2016/ink" xmlns:am3d="http://schemas.microsoft.com/office/drawing/2017/model3d" xmlns:o="urn:schemas-microsoft-com:office:office" xmlns:oel="http://schemas.microsoft.com/office/2019/extlst" xmlns:r="http://schemas.openxmlformats.org/officeDocument/2006/relationships" xmlns:m="http://schemas.openxmlformats.org/officeDocument/2006/math" xmlns:v="urn:schemas-microsoft-com:vml" xmlns:wp14="http://schemas.microsoft.com/office/word/2010/wordprocessingDrawing" xmlns:wp="http://schemas.openxmlformats.org/drawingml/2006/wordprocessingDrawing" xmlns:w10="urn:schemas-microsoft-com:office:word" xmlns:w="http://schemas.openxmlformats.org/wordprocessingml/2006/main" xmlns:w14="http://schemas.microsoft.com/office/word/2010/wordml" xmlns:w15="http://schemas.microsoft.com/office/word/2012/wordml" xmlns:w16cex="http://schemas.microsoft.com/office/word/2018/wordml/cex" xmlns:w16cid="http://schemas.microsoft.com/office/word/2016/wordml/cid" xmlns:w16="http://schemas.microsoft.com/office/word/2018/wordml" xmlns:w16du="http://schemas.microsoft.com/office/word/2023/wordml/word16du" xmlns:w16sdtdh="http://schemas.microsoft.com/office/word/2020/wordml/sdtdatahash" xmlns:w16sdtfl="http://schemas.microsoft.com/office/word/2024/wordml/sdtformatlock" xmlns:w16se="http://schemas.microsoft.com/office/word/2015/wordml/symex" xmlns:wpg="http://schemas.microsoft.com/office/word/2010/wordprocessingGroup" xmlns:wpi="http://schemas.microsoft.com/office/word/2010/wordprocessingInk" xmlns:wne="http://schemas.microsoft.com/office/word/2006/wordml" xmlns:wps="http://schemas.microsoft.com/office/word/2010/wordprocessingShape" mc:Ignorable="w14 w15 w16se w16cid w16 w16cex w16sdtdh w16sdtfl w16du wp14">
+  <w:p>
+    <w:pPr>
+      <w:pStyle w:val="Header"/>
+    </w:pPr>
   </w:p>
 </w:hdr>
 </file>
@@ -11217,6 +10919,50 @@
       <w:szCs w:val="20"/>
     </w:rPr>
   </w:style>
+  <w:style w:type="paragraph" w:styleId="Header">
+    <w:name w:val="header"/>
+    <w:basedOn w:val="Normal"/>
+    <w:link w:val="HeaderChar"/>
+    <w:uiPriority w:val="99"/>
+    <w:unhideWhenUsed/>
+    <w:rsid w:val="000564E0"/>
+    <w:pPr>
+      <w:tabs>
+        <w:tab w:val="center" w:pos="4680"/>
+        <w:tab w:val="right" w:pos="9360"/>
+      </w:tabs>
+      <w:spacing w:line="240" w:lineRule="auto"/>
+    </w:pPr>
+  </w:style>
+  <w:style w:type="character" w:customStyle="1" w:styleId="HeaderChar">
+    <w:name w:val="Header Char"/>
+    <w:basedOn w:val="DefaultParagraphFont"/>
+    <w:link w:val="Header"/>
+    <w:uiPriority w:val="99"/>
+    <w:rsid w:val="000564E0"/>
+  </w:style>
+  <w:style w:type="paragraph" w:styleId="Footer">
+    <w:name w:val="footer"/>
+    <w:basedOn w:val="Normal"/>
+    <w:link w:val="FooterChar"/>
+    <w:uiPriority w:val="99"/>
+    <w:unhideWhenUsed/>
+    <w:rsid w:val="000564E0"/>
+    <w:pPr>
+      <w:tabs>
+        <w:tab w:val="center" w:pos="4680"/>
+        <w:tab w:val="right" w:pos="9360"/>
+      </w:tabs>
+      <w:spacing w:line="240" w:lineRule="auto"/>
+    </w:pPr>
+  </w:style>
+  <w:style w:type="character" w:customStyle="1" w:styleId="FooterChar">
+    <w:name w:val="Footer Char"/>
+    <w:basedOn w:val="DefaultParagraphFont"/>
+    <w:link w:val="Footer"/>
+    <w:uiPriority w:val="99"/>
+    <w:rsid w:val="000564E0"/>
+  </w:style>
 </w:styles>
 </file>
 

</xml_diff>